<commit_message>
added git link to doc
</commit_message>
<xml_diff>
--- a/module-7/RylanderMod7.21.docx
+++ b/module-7/RylanderMod7.21.docx
@@ -54,8 +54,22 @@
         <w:jc w:val="left"/>
       </w:pPr>
       <w:r>
+        <w:rPr/>
+        <w:t>https://github.com/jordynrylander/csd-310</w:t>
+      </w:r>
+    </w:p>
+    <w:p>
+      <w:pPr>
+        <w:pStyle w:val="Normal"/>
+        <w:suppressLineNumbers w:val="0"/>
+        <w:bidi w:val="0"/>
+        <w:spacing w:before="0" w:beforeAutospacing="off" w:after="160" w:afterAutospacing="off" w:line="279" w:lineRule="auto"/>
+        <w:ind w:left="0" w:right="0"/>
+        <w:jc w:val="left"/>
+      </w:pPr>
+      <w:r>
         <w:drawing>
-          <wp:inline wp14:editId="346C0C86" wp14:anchorId="64877B4E">
+          <wp:inline wp14:editId="330B7DF5" wp14:anchorId="64877B4E">
             <wp:extent cx="3943350" cy="8543925"/>
             <wp:effectExtent l="0" t="0" r="0" b="0"/>
             <wp:docPr id="1633161447" name="drawing"/>

</xml_diff>